<commit_message>
feature: allowed preprocessed CSV to be a valid input and updated the downloadables
</commit_message>
<xml_diff>
--- a/backend/src/integritree/templates/Experiment-Paper-Template.docx
+++ b/backend/src/integritree/templates/Experiment-Paper-Template.docx
@@ -199,48 +199,34 @@
                 <w:b/>
                 <w:bCs/>
               </w:rPr>
-              <w:t>Predicted</w:t>
+              <w:t>Predicted Fraudulent</w:t>
             </w:r>
-            <w:r>
+          </w:p>
+        </w:tc>
+        <w:tc>
+          <w:tcPr>
+            <w:tcW w:w="2877" w:type="dxa"/>
+            <w:tcBorders>
+              <w:bottom w:val="double" w:sz="4" w:space="0" w:color="auto"/>
+            </w:tcBorders>
+            <w:shd w:val="clear" w:color="auto" w:fill="D9D9D9" w:themeFill="background1" w:themeFillShade="D9"/>
+            <w:vAlign w:val="center"/>
+          </w:tcPr>
+          <w:p>
+            <w:pPr>
+              <w:spacing w:before="120" w:after="120"/>
+              <w:jc w:val="center"/>
               <w:rPr>
                 <w:b/>
                 <w:bCs/>
               </w:rPr>
-              <w:t xml:space="preserve"> Fraudulent</w:t>
-            </w:r>
-          </w:p>
-        </w:tc>
-        <w:tc>
-          <w:tcPr>
-            <w:tcW w:w="2877" w:type="dxa"/>
-            <w:tcBorders>
-              <w:bottom w:val="double" w:sz="4" w:space="0" w:color="auto"/>
-            </w:tcBorders>
-            <w:shd w:val="clear" w:color="auto" w:fill="D9D9D9" w:themeFill="background1" w:themeFillShade="D9"/>
-            <w:vAlign w:val="center"/>
-          </w:tcPr>
-          <w:p>
-            <w:pPr>
-              <w:spacing w:before="120" w:after="120"/>
-              <w:jc w:val="center"/>
+            </w:pPr>
+            <w:r>
               <w:rPr>
                 <w:b/>
                 <w:bCs/>
               </w:rPr>
-            </w:pPr>
-            <w:r>
-              <w:rPr>
-                <w:b/>
-                <w:bCs/>
-              </w:rPr>
-              <w:t>Predicted</w:t>
-            </w:r>
-            <w:r>
-              <w:rPr>
-                <w:b/>
-                <w:bCs/>
-              </w:rPr>
-              <w:t xml:space="preserve"> Legitimate</w:t>
+              <w:t>Predicted Legitimate</w:t>
             </w:r>
           </w:p>
         </w:tc>
@@ -293,6 +279,13 @@
                 <w:iCs/>
               </w:rPr>
             </w:pPr>
+            <w:r>
+              <w:rPr>
+                <w:i/>
+                <w:iCs/>
+              </w:rPr>
+              <w:t>TP</w:t>
+            </w:r>
           </w:p>
         </w:tc>
         <w:tc>
@@ -313,6 +306,13 @@
                 <w:iCs/>
               </w:rPr>
             </w:pPr>
+            <w:r>
+              <w:rPr>
+                <w:i/>
+                <w:iCs/>
+              </w:rPr>
+              <w:t>FN</w:t>
+            </w:r>
           </w:p>
         </w:tc>
       </w:tr>
@@ -362,6 +362,13 @@
                 <w:iCs/>
               </w:rPr>
             </w:pPr>
+            <w:r>
+              <w:rPr>
+                <w:i/>
+                <w:iCs/>
+              </w:rPr>
+              <w:t>FP</w:t>
+            </w:r>
           </w:p>
         </w:tc>
         <w:tc>
@@ -381,6 +388,13 @@
                 <w:iCs/>
               </w:rPr>
             </w:pPr>
+            <w:r>
+              <w:rPr>
+                <w:i/>
+                <w:iCs/>
+              </w:rPr>
+              <w:t>TN</w:t>
+            </w:r>
           </w:p>
         </w:tc>
       </w:tr>
@@ -478,48 +492,34 @@
                 <w:b/>
                 <w:bCs/>
               </w:rPr>
-              <w:t>Predicted</w:t>
+              <w:t>Predicted Fraudulent</w:t>
             </w:r>
-            <w:r>
+          </w:p>
+        </w:tc>
+        <w:tc>
+          <w:tcPr>
+            <w:tcW w:w="2877" w:type="dxa"/>
+            <w:tcBorders>
+              <w:bottom w:val="double" w:sz="4" w:space="0" w:color="auto"/>
+            </w:tcBorders>
+            <w:shd w:val="clear" w:color="auto" w:fill="D9D9D9" w:themeFill="background1" w:themeFillShade="D9"/>
+            <w:vAlign w:val="center"/>
+          </w:tcPr>
+          <w:p>
+            <w:pPr>
+              <w:spacing w:before="120" w:after="120"/>
+              <w:jc w:val="center"/>
               <w:rPr>
                 <w:b/>
                 <w:bCs/>
               </w:rPr>
-              <w:t xml:space="preserve"> Fraudulent</w:t>
-            </w:r>
-          </w:p>
-        </w:tc>
-        <w:tc>
-          <w:tcPr>
-            <w:tcW w:w="2877" w:type="dxa"/>
-            <w:tcBorders>
-              <w:bottom w:val="double" w:sz="4" w:space="0" w:color="auto"/>
-            </w:tcBorders>
-            <w:shd w:val="clear" w:color="auto" w:fill="D9D9D9" w:themeFill="background1" w:themeFillShade="D9"/>
-            <w:vAlign w:val="center"/>
-          </w:tcPr>
-          <w:p>
-            <w:pPr>
-              <w:spacing w:before="120" w:after="120"/>
-              <w:jc w:val="center"/>
+            </w:pPr>
+            <w:r>
               <w:rPr>
                 <w:b/>
                 <w:bCs/>
               </w:rPr>
-            </w:pPr>
-            <w:r>
-              <w:rPr>
-                <w:b/>
-                <w:bCs/>
-              </w:rPr>
-              <w:t>Predicted</w:t>
-            </w:r>
-            <w:r>
-              <w:rPr>
-                <w:b/>
-                <w:bCs/>
-              </w:rPr>
-              <w:t xml:space="preserve"> Legitimate</w:t>
+              <w:t>Predicted Legitimate</w:t>
             </w:r>
           </w:p>
         </w:tc>
@@ -568,10 +568,17 @@
               <w:spacing w:before="120" w:after="120"/>
               <w:jc w:val="center"/>
               <w:rPr>
+                <w:b/>
+                <w:bCs/>
+              </w:rPr>
+            </w:pPr>
+            <w:r>
+              <w:rPr>
                 <w:i/>
                 <w:iCs/>
               </w:rPr>
-            </w:pPr>
+              <w:t>TP</w:t>
+            </w:r>
           </w:p>
         </w:tc>
         <w:tc>
@@ -587,11 +594,14 @@
             <w:pPr>
               <w:spacing w:before="120" w:after="120"/>
               <w:jc w:val="center"/>
+            </w:pPr>
+            <w:r>
               <w:rPr>
                 <w:i/>
                 <w:iCs/>
               </w:rPr>
-            </w:pPr>
+              <w:t>FN</w:t>
+            </w:r>
           </w:p>
         </w:tc>
       </w:tr>
@@ -637,10 +647,17 @@
               <w:spacing w:before="120" w:after="120"/>
               <w:jc w:val="center"/>
               <w:rPr>
+                <w:b/>
+                <w:bCs/>
+              </w:rPr>
+            </w:pPr>
+            <w:r>
+              <w:rPr>
                 <w:i/>
                 <w:iCs/>
               </w:rPr>
-            </w:pPr>
+              <w:t>FP</w:t>
+            </w:r>
           </w:p>
         </w:tc>
         <w:tc>
@@ -655,11 +672,14 @@
             <w:pPr>
               <w:spacing w:before="120" w:after="120"/>
               <w:jc w:val="center"/>
+            </w:pPr>
+            <w:r>
               <w:rPr>
                 <w:i/>
                 <w:iCs/>
               </w:rPr>
-            </w:pPr>
+              <w:t>TN</w:t>
+            </w:r>
           </w:p>
         </w:tc>
       </w:tr>
@@ -667,6 +687,13 @@
     <w:p>
       <w:pPr>
         <w:spacing w:line="480" w:lineRule="auto"/>
+        <w:sectPr>
+          <w:headerReference w:type="default" r:id="rId7"/>
+          <w:pgSz w:w="12240" w:h="18720"/>
+          <w:pgMar w:top="1440" w:right="1440" w:bottom="1440" w:left="2160" w:header="706" w:footer="706" w:gutter="0"/>
+          <w:cols w:space="708"/>
+          <w:docGrid w:linePitch="360"/>
+        </w:sectPr>
       </w:pPr>
     </w:p>
     <w:p>
@@ -679,6 +706,7 @@
           <w:b/>
           <w:bCs/>
         </w:rPr>
+        <w:lastRenderedPageBreak/>
         <w:t>Evaluation Metrics:</w:t>
       </w:r>
       <w:r>
@@ -716,11 +744,7 @@
         <w:t>C</w:t>
       </w:r>
       <w:r>
-        <w:t xml:space="preserve">oefficient (MCC), and PR-AUC measured using Average Precision (AP) will quantify model performance. Precision, recall, F1-score, and MCC will be calculated from each model’s confusion-matrix counts in Tables 1 and 2. AP will be calculated from the actual labels and each model’s fraud </w:t>
-      </w:r>
-      <w:r>
-        <w:lastRenderedPageBreak/>
-        <w:t>scores across score thresholds. The results will be presented in Table 3</w:t>
+        <w:t>oefficient (MCC), and PR-AUC measured using Average Precision (AP) will quantify model performance. Precision, recall, F1-score, and MCC will be calculated from each model’s confusion-matrix counts in Tables 1 and 2. AP will be calculated from the actual labels and each model’s fraud scores across score thresholds. The results will be presented in Table 3</w:t>
       </w:r>
       <w:r>
         <w:t xml:space="preserve"> using the following formulas:</w:t>
@@ -957,7 +981,6 @@
           <m:naryPr>
             <m:chr m:val="∑"/>
             <m:limLoc m:val="undOvr"/>
-            <m:supHide m:val="1"/>
             <m:ctrlPr>
               <w:rPr>
                 <w:rFonts w:ascii="Cambria Math" w:hAnsi="Cambria Math" w:cs="Arial"/>
@@ -970,98 +993,87 @@
               <w:rPr>
                 <w:rFonts w:ascii="Cambria Math" w:hAnsi="Cambria Math" w:cs="Arial"/>
               </w:rPr>
-              <m:t>i</m:t>
+              <m:t>i=1</m:t>
             </m:r>
           </m:sub>
-          <m:sup/>
+          <m:sup>
+            <m:r>
+              <w:rPr>
+                <w:rFonts w:ascii="Cambria Math" w:hAnsi="Cambria Math" w:cs="Arial"/>
+              </w:rPr>
+              <m:t>m</m:t>
+            </m:r>
+          </m:sup>
           <m:e>
-            <m:d>
-              <m:dPr>
+            <m:r>
+              <w:rPr>
+                <w:rFonts w:ascii="Cambria Math" w:hAnsi="Cambria Math" w:cs="Arial"/>
+              </w:rPr>
+              <m:t>(</m:t>
+            </m:r>
+            <m:sSub>
+              <m:sSubPr>
                 <m:ctrlPr>
                   <w:rPr>
                     <w:rFonts w:ascii="Cambria Math" w:hAnsi="Cambria Math" w:cs="Arial"/>
                     <w:i/>
                   </w:rPr>
                 </m:ctrlPr>
-              </m:dPr>
+              </m:sSubPr>
               <m:e>
-                <m:sSub>
-                  <m:sSubPr>
-                    <m:ctrlPr>
-                      <w:rPr>
-                        <w:rFonts w:ascii="Cambria Math" w:hAnsi="Cambria Math" w:cs="Arial"/>
-                        <w:i/>
-                      </w:rPr>
-                    </m:ctrlPr>
-                  </m:sSubPr>
-                  <m:e>
-                    <m:r>
-                      <w:rPr>
-                        <w:rFonts w:ascii="Cambria Math" w:hAnsi="Cambria Math" w:cs="Arial"/>
-                      </w:rPr>
-                      <m:t>R</m:t>
-                    </m:r>
-                  </m:e>
-                  <m:sub>
-                    <m:r>
-                      <w:rPr>
-                        <w:rFonts w:ascii="Cambria Math" w:hAnsi="Cambria Math" w:cs="Arial"/>
-                      </w:rPr>
-                      <m:t>i</m:t>
-                    </m:r>
-                  </m:sub>
-                </m:sSub>
                 <m:r>
                   <w:rPr>
                     <w:rFonts w:ascii="Cambria Math" w:hAnsi="Cambria Math" w:cs="Arial"/>
                   </w:rPr>
-                  <m:t>-</m:t>
+                  <m:t>R</m:t>
                 </m:r>
-                <m:sSub>
-                  <m:sSubPr>
-                    <m:ctrlPr>
-                      <w:rPr>
-                        <w:rFonts w:ascii="Cambria Math" w:hAnsi="Cambria Math" w:cs="Arial"/>
-                        <w:i/>
-                      </w:rPr>
-                    </m:ctrlPr>
-                  </m:sSubPr>
-                  <m:e>
-                    <m:r>
-                      <w:rPr>
-                        <w:rFonts w:ascii="Cambria Math" w:hAnsi="Cambria Math" w:cs="Arial"/>
-                      </w:rPr>
-                      <m:t>R</m:t>
-                    </m:r>
-                  </m:e>
-                  <m:sub>
-                    <m:d>
-                      <m:dPr>
-                        <m:ctrlPr>
-                          <w:rPr>
-                            <w:rFonts w:ascii="Cambria Math" w:hAnsi="Cambria Math" w:cs="Arial"/>
-                            <w:i/>
-                          </w:rPr>
-                        </m:ctrlPr>
-                      </m:dPr>
-                      <m:e>
-                        <m:r>
-                          <w:rPr>
-                            <w:rFonts w:ascii="Cambria Math" w:hAnsi="Cambria Math" w:cs="Arial"/>
-                          </w:rPr>
-                          <m:t>i-1</m:t>
-                        </m:r>
-                      </m:e>
-                    </m:d>
-                  </m:sub>
-                </m:sSub>
               </m:e>
-            </m:d>
+              <m:sub>
+                <m:r>
+                  <w:rPr>
+                    <w:rFonts w:ascii="Cambria Math" w:hAnsi="Cambria Math" w:cs="Arial"/>
+                  </w:rPr>
+                  <m:t>i</m:t>
+                </m:r>
+              </m:sub>
+            </m:sSub>
             <m:r>
               <w:rPr>
                 <w:rFonts w:ascii="Cambria Math" w:hAnsi="Cambria Math" w:cs="Arial"/>
               </w:rPr>
-              <m:t>*</m:t>
+              <m:t>-</m:t>
+            </m:r>
+            <m:sSub>
+              <m:sSubPr>
+                <m:ctrlPr>
+                  <w:rPr>
+                    <w:rFonts w:ascii="Cambria Math" w:hAnsi="Cambria Math" w:cs="Arial"/>
+                    <w:i/>
+                  </w:rPr>
+                </m:ctrlPr>
+              </m:sSubPr>
+              <m:e>
+                <m:r>
+                  <w:rPr>
+                    <w:rFonts w:ascii="Cambria Math" w:hAnsi="Cambria Math" w:cs="Arial"/>
+                  </w:rPr>
+                  <m:t>R</m:t>
+                </m:r>
+              </m:e>
+              <m:sub>
+                <m:r>
+                  <w:rPr>
+                    <w:rFonts w:ascii="Cambria Math" w:hAnsi="Cambria Math" w:cs="Arial"/>
+                  </w:rPr>
+                  <m:t>i-1</m:t>
+                </m:r>
+              </m:sub>
+            </m:sSub>
+            <m:r>
+              <w:rPr>
+                <w:rFonts w:ascii="Cambria Math" w:hAnsi="Cambria Math" w:cs="Arial"/>
+              </w:rPr>
+              <m:t>)</m:t>
             </m:r>
             <m:sSub>
               <m:sSubPr>
@@ -1107,63 +1119,50 @@
           <w:numId w:val="3"/>
         </w:numPr>
         <w:spacing w:line="480" w:lineRule="auto"/>
-        <w:rPr>
-          <w:rFonts w:cs="Arial"/>
-          <w:i/>
-        </w:rPr>
-      </w:pPr>
-      <w:r>
-        <w:rPr>
-          <w:rFonts w:cs="Arial"/>
-          <w:i/>
-        </w:rPr>
-        <w:t>R</w:t>
-      </w:r>
-      <w:r>
-        <w:rPr>
-          <w:rFonts w:cs="Arial"/>
-          <w:i/>
+      </w:pPr>
+      <w:r>
+        <w:rPr>
+          <w:i/>
+          <w:iCs/>
+        </w:rPr>
+        <w:t>P</w:t>
+      </w:r>
+      <w:r>
+        <w:rPr>
+          <w:i/>
+          <w:iCs/>
           <w:vertAlign w:val="subscript"/>
         </w:rPr>
         <w:t>i</w:t>
       </w:r>
       <w:r>
         <w:rPr>
-          <w:rFonts w:cs="Arial"/>
-          <w:i/>
+          <w:i/>
+          <w:iCs/>
         </w:rPr>
         <w:t xml:space="preserve"> </w:t>
       </w:r>
       <w:r>
-        <w:rPr>
-          <w:rFonts w:cs="Arial"/>
-          <w:i/>
-        </w:rPr>
-        <w:t>is recall</w:t>
-      </w:r>
-      <w:r>
-        <w:rPr>
-          <w:rFonts w:cs="Arial"/>
-          <w:i/>
-        </w:rPr>
-        <w:t xml:space="preserve"> at point</w:t>
-      </w:r>
-      <w:r>
-        <w:rPr>
-          <w:rFonts w:cs="Arial"/>
-          <w:i/>
-        </w:rPr>
+        <w:t xml:space="preserve">= </w:t>
+      </w:r>
+      <w:r>
+        <w:t>Precision at operating point</w:t>
+      </w:r>
+      <w:r>
         <w:t xml:space="preserve"> </w:t>
       </w:r>
       <w:proofErr w:type="spellStart"/>
       <w:r>
         <w:rPr>
-          <w:rFonts w:cs="Arial"/>
-          <w:i/>
+          <w:i/>
+          <w:iCs/>
         </w:rPr>
         <w:t>i</w:t>
       </w:r>
       <w:proofErr w:type="spellEnd"/>
+      <w:r>
+        <w:t>.</w:t>
+      </w:r>
     </w:p>
     <w:p>
       <w:pPr>
@@ -1173,6 +1172,135 @@
           <w:numId w:val="3"/>
         </w:numPr>
         <w:spacing w:line="480" w:lineRule="auto"/>
+      </w:pPr>
+      <w:r>
+        <w:rPr>
+          <w:i/>
+          <w:iCs/>
+        </w:rPr>
+        <w:t>R</w:t>
+      </w:r>
+      <w:r>
+        <w:rPr>
+          <w:i/>
+          <w:iCs/>
+          <w:vertAlign w:val="subscript"/>
+        </w:rPr>
+        <w:t>i</w:t>
+      </w:r>
+      <w:r>
+        <w:rPr>
+          <w:i/>
+          <w:iCs/>
+        </w:rPr>
+        <w:t xml:space="preserve"> </w:t>
+      </w:r>
+      <w:r>
+        <w:t>= Recall</w:t>
+      </w:r>
+      <w:r>
+        <w:t xml:space="preserve"> at operating point</w:t>
+      </w:r>
+      <w:r>
+        <w:t xml:space="preserve"> </w:t>
+      </w:r>
+      <w:proofErr w:type="spellStart"/>
+      <w:r>
+        <w:rPr>
+          <w:i/>
+          <w:iCs/>
+        </w:rPr>
+        <w:t>i</w:t>
+      </w:r>
+      <w:proofErr w:type="spellEnd"/>
+      <w:r>
+        <w:t>.</w:t>
+      </w:r>
+    </w:p>
+    <w:p>
+      <w:pPr>
+        <w:pStyle w:val="ListParagraph"/>
+        <w:numPr>
+          <w:ilvl w:val="1"/>
+          <w:numId w:val="3"/>
+        </w:numPr>
+        <w:spacing w:line="480" w:lineRule="auto"/>
+      </w:pPr>
+      <w:r>
+        <w:rPr>
+          <w:i/>
+          <w:iCs/>
+        </w:rPr>
+        <w:t>R</w:t>
+      </w:r>
+      <w:r>
+        <w:rPr>
+          <w:i/>
+          <w:iCs/>
+          <w:vertAlign w:val="subscript"/>
+        </w:rPr>
+        <w:t>i</w:t>
+      </w:r>
+      <w:r>
+        <w:rPr>
+          <w:i/>
+          <w:iCs/>
+          <w:vertAlign w:val="subscript"/>
+        </w:rPr>
+        <w:t>-1</w:t>
+      </w:r>
+      <w:r>
+        <w:rPr>
+          <w:i/>
+          <w:iCs/>
+        </w:rPr>
+        <w:t xml:space="preserve"> </w:t>
+      </w:r>
+      <w:r>
+        <w:t xml:space="preserve">= </w:t>
+      </w:r>
+      <w:r>
+        <w:t>Recall at the preceding operating point, with</w:t>
+      </w:r>
+      <w:r>
+        <w:rPr>
+          <w:i/>
+          <w:iCs/>
+        </w:rPr>
+        <w:t xml:space="preserve"> R</w:t>
+      </w:r>
+      <w:r>
+        <w:rPr>
+          <w:i/>
+          <w:iCs/>
+          <w:vertAlign w:val="subscript"/>
+        </w:rPr>
+        <w:t>0</w:t>
+      </w:r>
+      <w:r>
+        <w:rPr>
+          <w:i/>
+          <w:iCs/>
+        </w:rPr>
+        <w:t xml:space="preserve"> = 0.</w:t>
+      </w:r>
+      <w:r>
+        <w:rPr>
+          <w:i/>
+          <w:iCs/>
+          <w:vertAlign w:val="subscript"/>
+        </w:rPr>
+        <w:t xml:space="preserve"> </w:t>
+      </w:r>
+    </w:p>
+    <w:p>
+      <w:pPr>
+        <w:pStyle w:val="ListParagraph"/>
+        <w:numPr>
+          <w:ilvl w:val="1"/>
+          <w:numId w:val="3"/>
+        </w:numPr>
+        <w:spacing w:line="480" w:lineRule="auto"/>
         <w:rPr>
           <w:rFonts w:cs="Arial"/>
           <w:i/>
@@ -1180,56 +1308,24 @@
       </w:pPr>
       <w:r>
         <w:rPr>
-          <w:rFonts w:cs="Arial"/>
-          <w:i/>
-        </w:rPr>
-        <w:t>P</w:t>
-      </w:r>
-      <w:r>
-        <w:rPr>
-          <w:rFonts w:cs="Arial"/>
-          <w:i/>
-          <w:vertAlign w:val="subscript"/>
-        </w:rPr>
-        <w:t>i</w:t>
-      </w:r>
-      <w:r>
-        <w:rPr>
-          <w:rFonts w:cs="Arial"/>
-          <w:i/>
+          <w:i/>
+          <w:iCs/>
+        </w:rPr>
+        <w:t>m</w:t>
+      </w:r>
+      <w:r>
+        <w:rPr>
+          <w:i/>
+          <w:iCs/>
         </w:rPr>
         <w:t xml:space="preserve"> </w:t>
       </w:r>
       <w:r>
-        <w:rPr>
-          <w:rFonts w:cs="Arial"/>
-          <w:i/>
-        </w:rPr>
-        <w:t xml:space="preserve">is </w:t>
-      </w:r>
-      <w:r>
-        <w:rPr>
-          <w:rFonts w:cs="Arial"/>
-          <w:i/>
-        </w:rPr>
-        <w:t>precision at point</w:t>
-      </w:r>
-      <w:r>
-        <w:rPr>
-          <w:rFonts w:cs="Arial"/>
-          <w:i/>
-        </w:rPr>
-        <w:t xml:space="preserve"> </w:t>
-      </w:r>
-      <w:proofErr w:type="spellStart"/>
-      <w:r>
-        <w:rPr>
-          <w:rFonts w:cs="Arial"/>
-          <w:i/>
-        </w:rPr>
-        <w:t>i</w:t>
-      </w:r>
-      <w:proofErr w:type="spellEnd"/>
+        <w:t xml:space="preserve">= </w:t>
+      </w:r>
+      <w:r>
+        <w:t>Number of operating points, ordered by increasing recall.</w:t>
+      </w:r>
     </w:p>
     <w:p>
       <w:pPr>
@@ -1259,7 +1355,7 @@
           <w:rPr>
             <w:rFonts w:ascii="Cambria Math" w:hAnsi="Cambria Math" w:cs="Arial"/>
           </w:rPr>
-          <m:t>Percentage Difference=100*</m:t>
+          <m:t>Percentage Difference=</m:t>
         </m:r>
         <m:f>
           <m:fPr>
@@ -1275,25 +1371,94 @@
               <w:rPr>
                 <w:rFonts w:ascii="Cambria Math" w:hAnsi="Cambria Math" w:cs="Arial"/>
               </w:rPr>
-              <m:t>A-B</m:t>
+              <m:t>B-A</m:t>
             </m:r>
           </m:num>
           <m:den>
-            <m:r>
-              <w:rPr>
-                <w:rFonts w:ascii="Cambria Math" w:hAnsi="Cambria Math" w:cs="Arial"/>
-              </w:rPr>
-              <m:t>(A+B)/2</m:t>
-            </m:r>
+            <m:f>
+              <m:fPr>
+                <m:ctrlPr>
+                  <w:rPr>
+                    <w:rFonts w:ascii="Cambria Math" w:hAnsi="Cambria Math" w:cs="Arial"/>
+                    <w:i/>
+                  </w:rPr>
+                </m:ctrlPr>
+              </m:fPr>
+              <m:num>
+                <m:r>
+                  <w:rPr>
+                    <w:rFonts w:ascii="Cambria Math" w:hAnsi="Cambria Math" w:cs="Arial"/>
+                  </w:rPr>
+                  <m:t>(A+B)</m:t>
+                </m:r>
+              </m:num>
+              <m:den>
+                <m:r>
+                  <w:rPr>
+                    <w:rFonts w:ascii="Cambria Math" w:hAnsi="Cambria Math" w:cs="Arial"/>
+                  </w:rPr>
+                  <m:t>2</m:t>
+                </m:r>
+              </m:den>
+            </m:f>
           </m:den>
         </m:f>
         <m:r>
           <w:rPr>
             <w:rFonts w:ascii="Cambria Math" w:hAnsi="Cambria Math" w:cs="Arial"/>
           </w:rPr>
-          <m:t>, where</m:t>
+          <m:t>*100, where</m:t>
         </m:r>
       </m:oMath>
+    </w:p>
+    <w:p>
+      <w:pPr>
+        <w:pStyle w:val="ListParagraph"/>
+        <w:numPr>
+          <w:ilvl w:val="1"/>
+          <w:numId w:val="4"/>
+        </w:numPr>
+        <w:spacing w:after="0" w:line="480" w:lineRule="auto"/>
+        <w:contextualSpacing w:val="0"/>
+        <w:rPr>
+          <w:i/>
+        </w:rPr>
+      </w:pPr>
+      <w:r>
+        <w:rPr>
+          <w:i/>
+          <w:iCs/>
+        </w:rPr>
+        <w:t>A</w:t>
+      </w:r>
+      <w:r>
+        <w:rPr>
+          <w:i/>
+          <w:iCs/>
+        </w:rPr>
+        <w:t xml:space="preserve"> </w:t>
+      </w:r>
+      <w:r>
+        <w:t>=</w:t>
+      </w:r>
+      <w:r>
+        <w:rPr>
+          <w:i/>
+        </w:rPr>
+        <w:t xml:space="preserve"> </w:t>
+      </w:r>
+      <w:r>
+        <w:rPr>
+          <w:i/>
+        </w:rPr>
+        <w:t>Benchmark RF metric score</w:t>
+      </w:r>
+      <w:r>
+        <w:rPr>
+          <w:i/>
+        </w:rPr>
+        <w:t>.</w:t>
+      </w:r>
     </w:p>
     <w:p>
       <w:pPr>
@@ -1303,74 +1468,76 @@
           <w:numId w:val="4"/>
         </w:numPr>
         <w:spacing w:line="480" w:lineRule="auto"/>
+        <w:contextualSpacing w:val="0"/>
+        <w:rPr>
+          <w:i/>
+        </w:rPr>
+      </w:pPr>
+      <w:r>
+        <w:rPr>
+          <w:i/>
+          <w:iCs/>
+        </w:rPr>
+        <w:t>B</w:t>
+      </w:r>
+      <w:r>
+        <w:rPr>
+          <w:i/>
+          <w:iCs/>
+        </w:rPr>
+        <w:t xml:space="preserve"> </w:t>
+      </w:r>
+      <w:r>
+        <w:t>=</w:t>
+      </w:r>
+      <w:r>
+        <w:rPr>
+          <w:i/>
+        </w:rPr>
+        <w:t xml:space="preserve"> </w:t>
+      </w:r>
+      <w:r>
+        <w:rPr>
+          <w:i/>
+        </w:rPr>
+        <w:t>RF-SMOTE metric score</w:t>
+      </w:r>
+      <w:r>
+        <w:rPr>
+          <w:i/>
+        </w:rPr>
+        <w:t>.</w:t>
+      </w:r>
+      <w:r>
+        <w:rPr>
+          <w:i/>
+        </w:rPr>
+        <w:t xml:space="preserve"> </w:t>
+      </w:r>
+    </w:p>
+    <w:p>
+      <w:pPr>
+        <w:spacing w:line="480" w:lineRule="auto"/>
         <w:rPr>
           <w:rFonts w:cs="Arial"/>
           <w:i/>
         </w:rPr>
       </w:pPr>
-      <w:r>
+    </w:p>
+    <w:p>
+      <w:pPr>
+        <w:spacing w:line="480" w:lineRule="auto"/>
         <w:rPr>
           <w:rFonts w:cs="Arial"/>
           <w:i/>
         </w:rPr>
-        <w:t>A is</w:t>
-      </w:r>
-      <w:r>
-        <w:rPr>
-          <w:rFonts w:cs="Arial"/>
-          <w:i/>
-        </w:rPr>
-        <w:t xml:space="preserve"> the</w:t>
-      </w:r>
-      <w:r>
-        <w:rPr>
-          <w:rFonts w:cs="Arial"/>
-          <w:i/>
-        </w:rPr>
-        <w:t xml:space="preserve"> </w:t>
-      </w:r>
-      <w:r>
-        <w:rPr>
-          <w:rFonts w:cs="Arial"/>
-          <w:i/>
-        </w:rPr>
-        <w:t>RF-SMOTE metric value</w:t>
-      </w:r>
-    </w:p>
-    <w:p>
-      <w:pPr>
-        <w:pStyle w:val="ListParagraph"/>
-        <w:numPr>
-          <w:ilvl w:val="1"/>
-          <w:numId w:val="4"/>
-        </w:numPr>
-        <w:spacing w:line="480" w:lineRule="auto"/>
-        <w:rPr>
-          <w:rFonts w:cs="Arial"/>
-          <w:i/>
-        </w:rPr>
-      </w:pPr>
-      <w:r>
-        <w:rPr>
-          <w:rFonts w:cs="Arial"/>
-          <w:i/>
-        </w:rPr>
-        <w:t xml:space="preserve">B </w:t>
-      </w:r>
-      <w:r>
-        <w:rPr>
-          <w:rFonts w:cs="Arial"/>
-          <w:i/>
-        </w:rPr>
-        <w:t xml:space="preserve">is </w:t>
-      </w:r>
-      <w:r>
-        <w:rPr>
-          <w:rFonts w:cs="Arial"/>
-          <w:i/>
-        </w:rPr>
-        <w:t>the benchmark RF metric value</w:t>
-      </w:r>
+        <w:sectPr>
+          <w:pgSz w:w="12240" w:h="18720"/>
+          <w:pgMar w:top="1440" w:right="1440" w:bottom="1440" w:left="2160" w:header="706" w:footer="706" w:gutter="0"/>
+          <w:cols w:space="708"/>
+          <w:docGrid w:linePitch="360"/>
+        </w:sectPr>
+      </w:pPr>
     </w:p>
     <w:p>
       <w:pPr>
@@ -1378,6 +1545,7 @@
         <w:jc w:val="center"/>
       </w:pPr>
       <w:r>
+        <w:lastRenderedPageBreak/>
         <w:t>Table 3</w:t>
       </w:r>
     </w:p>
@@ -1719,10 +1887,6 @@
             <w:pPr>
               <w:spacing w:before="120" w:after="120"/>
               <w:jc w:val="center"/>
-              <w:rPr>
-                <w:i/>
-                <w:iCs/>
-              </w:rPr>
             </w:pPr>
           </w:p>
         </w:tc>
@@ -1738,10 +1902,6 @@
             <w:pPr>
               <w:spacing w:before="120" w:after="120"/>
               <w:jc w:val="center"/>
-              <w:rPr>
-                <w:i/>
-                <w:iCs/>
-              </w:rPr>
             </w:pPr>
           </w:p>
         </w:tc>
@@ -1757,10 +1917,6 @@
             <w:pPr>
               <w:spacing w:before="120" w:after="120"/>
               <w:jc w:val="center"/>
-              <w:rPr>
-                <w:i/>
-                <w:iCs/>
-              </w:rPr>
             </w:pPr>
           </w:p>
         </w:tc>
@@ -1776,10 +1932,6 @@
             <w:pPr>
               <w:spacing w:before="120" w:after="120"/>
               <w:jc w:val="center"/>
-              <w:rPr>
-                <w:i/>
-                <w:iCs/>
-              </w:rPr>
             </w:pPr>
           </w:p>
         </w:tc>
@@ -1795,10 +1947,6 @@
             <w:pPr>
               <w:spacing w:before="120" w:after="120"/>
               <w:jc w:val="center"/>
-              <w:rPr>
-                <w:i/>
-                <w:iCs/>
-              </w:rPr>
             </w:pPr>
           </w:p>
         </w:tc>
@@ -1842,10 +1990,6 @@
             <w:pPr>
               <w:spacing w:before="120" w:after="120"/>
               <w:jc w:val="center"/>
-              <w:rPr>
-                <w:i/>
-                <w:iCs/>
-              </w:rPr>
             </w:pPr>
           </w:p>
         </w:tc>
@@ -1861,10 +2005,6 @@
             <w:pPr>
               <w:spacing w:before="120" w:after="120"/>
               <w:jc w:val="center"/>
-              <w:rPr>
-                <w:i/>
-                <w:iCs/>
-              </w:rPr>
             </w:pPr>
           </w:p>
         </w:tc>
@@ -1880,10 +2020,6 @@
             <w:pPr>
               <w:spacing w:before="120" w:after="120"/>
               <w:jc w:val="center"/>
-              <w:rPr>
-                <w:i/>
-                <w:iCs/>
-              </w:rPr>
             </w:pPr>
           </w:p>
         </w:tc>
@@ -1899,10 +2035,6 @@
             <w:pPr>
               <w:spacing w:before="120" w:after="120"/>
               <w:jc w:val="center"/>
-              <w:rPr>
-                <w:i/>
-                <w:iCs/>
-              </w:rPr>
             </w:pPr>
           </w:p>
         </w:tc>
@@ -1918,10 +2050,6 @@
             <w:pPr>
               <w:spacing w:before="120" w:after="120"/>
               <w:jc w:val="center"/>
-              <w:rPr>
-                <w:i/>
-                <w:iCs/>
-              </w:rPr>
             </w:pPr>
           </w:p>
         </w:tc>
@@ -1976,10 +2104,6 @@
             <w:pPr>
               <w:spacing w:before="120" w:after="120"/>
               <w:jc w:val="center"/>
-              <w:rPr>
-                <w:i/>
-                <w:iCs/>
-              </w:rPr>
             </w:pPr>
           </w:p>
         </w:tc>
@@ -1997,10 +2121,6 @@
             <w:pPr>
               <w:spacing w:before="120" w:after="120"/>
               <w:jc w:val="center"/>
-              <w:rPr>
-                <w:i/>
-                <w:iCs/>
-              </w:rPr>
             </w:pPr>
           </w:p>
         </w:tc>
@@ -2018,10 +2138,6 @@
             <w:pPr>
               <w:spacing w:before="120" w:after="120"/>
               <w:jc w:val="center"/>
-              <w:rPr>
-                <w:i/>
-                <w:iCs/>
-              </w:rPr>
             </w:pPr>
           </w:p>
         </w:tc>
@@ -2039,10 +2155,6 @@
             <w:pPr>
               <w:spacing w:before="120" w:after="120"/>
               <w:jc w:val="center"/>
-              <w:rPr>
-                <w:i/>
-                <w:iCs/>
-              </w:rPr>
             </w:pPr>
           </w:p>
         </w:tc>
@@ -2060,10 +2172,6 @@
             <w:pPr>
               <w:spacing w:before="120" w:after="120"/>
               <w:jc w:val="center"/>
-              <w:rPr>
-                <w:i/>
-                <w:iCs/>
-              </w:rPr>
             </w:pPr>
           </w:p>
         </w:tc>
@@ -2072,13 +2180,6 @@
     <w:p>
       <w:pPr>
         <w:spacing w:line="720" w:lineRule="auto"/>
-        <w:sectPr>
-          <w:headerReference w:type="default" r:id="rId7"/>
-          <w:pgSz w:w="12240" w:h="18720"/>
-          <w:pgMar w:top="1440" w:right="1440" w:bottom="1440" w:left="2160" w:header="706" w:footer="706" w:gutter="0"/>
-          <w:cols w:space="708"/>
-          <w:docGrid w:linePitch="360"/>
-        </w:sectPr>
       </w:pPr>
     </w:p>
     <w:p>
@@ -2091,7 +2192,6 @@
           <w:b/>
           <w:bCs/>
         </w:rPr>
-        <w:lastRenderedPageBreak/>
         <w:t>Statistical Significance:</w:t>
       </w:r>
       <w:r>
@@ -2136,13 +2236,7 @@
         <w:rPr>
           <w:i/>
         </w:rPr>
-        <w:t xml:space="preserve"> </w:t>
-      </w:r>
-      <w:r>
-        <w:rPr>
-          <w:i/>
-        </w:rPr>
-        <w:t xml:space="preserve">is the </w:t>
+        <w:t xml:space="preserve"> is the </w:t>
       </w:r>
       <w:r>
         <w:rPr>
@@ -2174,13 +2268,7 @@
         <w:rPr>
           <w:i/>
         </w:rPr>
-        <w:t xml:space="preserve"> </w:t>
-      </w:r>
-      <w:r>
-        <w:rPr>
-          <w:i/>
-        </w:rPr>
-        <w:t xml:space="preserve">is the </w:t>
+        <w:t xml:space="preserve"> is the </w:t>
       </w:r>
       <w:r>
         <w:rPr>
@@ -2224,13 +2312,7 @@
         <w:rPr>
           <w:i/>
         </w:rPr>
-        <w:t xml:space="preserve"> </w:t>
-      </w:r>
-      <w:r>
-        <w:rPr>
-          <w:i/>
-        </w:rPr>
-        <w:t xml:space="preserve">is the </w:t>
+        <w:t xml:space="preserve"> is the </w:t>
       </w:r>
       <w:r>
         <w:rPr>
@@ -2271,13 +2353,7 @@
         <w:rPr>
           <w:i/>
         </w:rPr>
-        <w:t xml:space="preserve"> </w:t>
-      </w:r>
-      <w:r>
-        <w:rPr>
-          <w:i/>
-        </w:rPr>
-        <w:t xml:space="preserve">is the </w:t>
+        <w:t xml:space="preserve"> is the </w:t>
       </w:r>
       <w:r>
         <w:rPr>
@@ -2472,6 +2548,13 @@
                 <w:iCs/>
               </w:rPr>
             </w:pPr>
+            <w:r>
+              <w:rPr>
+                <w:i/>
+                <w:iCs/>
+              </w:rPr>
+              <w:t>A</w:t>
+            </w:r>
           </w:p>
         </w:tc>
         <w:tc>
@@ -2492,6 +2575,13 @@
                 <w:iCs/>
               </w:rPr>
             </w:pPr>
+            <w:r>
+              <w:rPr>
+                <w:i/>
+                <w:iCs/>
+              </w:rPr>
+              <w:t>B</w:t>
+            </w:r>
           </w:p>
         </w:tc>
       </w:tr>
@@ -2540,6 +2630,13 @@
                 <w:iCs/>
               </w:rPr>
             </w:pPr>
+            <w:r>
+              <w:rPr>
+                <w:i/>
+                <w:iCs/>
+              </w:rPr>
+              <w:t>C</w:t>
+            </w:r>
           </w:p>
         </w:tc>
         <w:tc>
@@ -2559,6 +2656,13 @@
                 <w:iCs/>
               </w:rPr>
             </w:pPr>
+            <w:r>
+              <w:rPr>
+                <w:i/>
+                <w:iCs/>
+              </w:rPr>
+              <w:t>D</w:t>
+            </w:r>
           </w:p>
         </w:tc>
       </w:tr>
@@ -2570,6 +2674,12 @@
           <w:b/>
           <w:bCs/>
         </w:rPr>
+        <w:sectPr>
+          <w:pgSz w:w="12240" w:h="18720"/>
+          <w:pgMar w:top="1440" w:right="1440" w:bottom="1440" w:left="2160" w:header="706" w:footer="706" w:gutter="0"/>
+          <w:cols w:space="708"/>
+          <w:docGrid w:linePitch="360"/>
+        </w:sectPr>
       </w:pPr>
     </w:p>
     <w:p>
@@ -2579,6 +2689,7 @@
         <w:jc w:val="both"/>
       </w:pPr>
       <w:r>
+        <w:lastRenderedPageBreak/>
         <w:t>T</w:t>
       </w:r>
       <w:r>
@@ -2839,8 +2950,8 @@
               <w:spacing w:before="120" w:after="120"/>
               <w:jc w:val="center"/>
               <w:rPr>
-                <w:i/>
-                <w:iCs/>
+                <w:b/>
+                <w:bCs/>
               </w:rPr>
             </w:pPr>
           </w:p>
@@ -2861,10 +2972,6 @@
             <w:pPr>
               <w:spacing w:before="120" w:after="120"/>
               <w:jc w:val="center"/>
-              <w:rPr>
-                <w:i/>
-                <w:iCs/>
-              </w:rPr>
             </w:pPr>
           </w:p>
         </w:tc>
@@ -2874,6 +2981,7 @@
       <w:pPr>
         <w:spacing w:line="720" w:lineRule="auto"/>
         <w:sectPr>
+          <w:headerReference w:type="default" r:id="rId8"/>
           <w:pgSz w:w="12240" w:h="18720"/>
           <w:pgMar w:top="1440" w:right="1440" w:bottom="1440" w:left="2160" w:header="706" w:footer="706" w:gutter="0"/>
           <w:cols w:space="708"/>
@@ -2978,6 +3086,28 @@
 </file>
 
 <file path=word/header1.xml><?xml version="1.0" encoding="utf-8"?>
+<w:hdr xmlns:wpc="http://schemas.microsoft.com/office/word/2010/wordprocessingCanvas" xmlns:cx="http://schemas.microsoft.com/office/drawing/2014/chartex" xmlns:cx1="http://schemas.microsoft.com/office/drawing/2015/9/8/chartex" xmlns:cx2="http://schemas.microsoft.com/office/drawing/2015/10/21/chartex" xmlns:cx3="http://schemas.microsoft.com/office/drawing/2016/5/9/chartex" xmlns:cx4="http://schemas.microsoft.com/office/drawing/2016/5/10/chartex" xmlns:cx5="http://schemas.microsoft.com/office/drawing/2016/5/11/chartex" xmlns:cx6="http://schemas.microsoft.com/office/drawing/2016/5/12/chartex" xmlns:cx7="http://schemas.microsoft.com/office/drawing/2016/5/13/chartex" xmlns:cx8="http://schemas.microsoft.com/office/drawing/2016/5/14/chartex" xmlns:mc="http://schemas.openxmlformats.org/markup-compatibility/2006" xmlns:aink="http://schemas.microsoft.com/office/drawing/2016/ink" xmlns:am3d="http://schemas.microsoft.com/office/drawing/2017/model3d" xmlns:o="urn:schemas-microsoft-com:office:office" xmlns:r="http://schemas.openxmlformats.org/officeDocument/2006/relationships" xmlns:m="http://schemas.openxmlformats.org/officeDocument/2006/math" xmlns:v="urn:schemas-microsoft-com:vml" xmlns:wp14="http://schemas.microsoft.com/office/word/2010/wordprocessingDrawing" xmlns:wp="http://schemas.openxmlformats.org/drawingml/2006/wordprocessingDrawing" xmlns:w10="urn:schemas-microsoft-com:office:word" xmlns:w="http://schemas.openxmlformats.org/wordprocessingml/2006/main" xmlns:w14="http://schemas.microsoft.com/office/word/2010/wordml" xmlns:w15="http://schemas.microsoft.com/office/word/2012/wordml" xmlns:w16cex="http://schemas.microsoft.com/office/word/2018/wordml/cex" xmlns:w16cid="http://schemas.microsoft.com/office/word/2016/wordml/cid" xmlns:w16="http://schemas.microsoft.com/office/word/2018/wordml" xmlns:w16sdtdh="http://schemas.microsoft.com/office/word/2020/wordml/sdtdatahash" xmlns:w16se="http://schemas.microsoft.com/office/word/2015/wordml/symex" xmlns:wpg="http://schemas.microsoft.com/office/word/2010/wordprocessingGroup" xmlns:wpi="http://schemas.microsoft.com/office/word/2010/wordprocessingInk" xmlns:wne="http://schemas.microsoft.com/office/word/2006/wordml" xmlns:wps="http://schemas.microsoft.com/office/word/2010/wordprocessingShape" mc:Ignorable="w14 w15 w16se w16cid w16 w16cex w16sdtdh wp14">
+  <w:p>
+    <w:pPr>
+      <w:pStyle w:val="Header"/>
+      <w:jc w:val="center"/>
+      <w:rPr>
+        <w:b/>
+        <w:bCs/>
+      </w:rPr>
+    </w:pPr>
+    <w:r>
+      <w:rPr>
+        <w:b/>
+        <w:bCs/>
+      </w:rPr>
+      <w:t>EXPERIMENT PAPER</w:t>
+    </w:r>
+  </w:p>
+</w:hdr>
+</file>
+
+<file path=word/header2.xml><?xml version="1.0" encoding="utf-8"?>
 <w:hdr xmlns:wpc="http://schemas.microsoft.com/office/word/2010/wordprocessingCanvas" xmlns:cx="http://schemas.microsoft.com/office/drawing/2014/chartex" xmlns:cx1="http://schemas.microsoft.com/office/drawing/2015/9/8/chartex" xmlns:cx2="http://schemas.microsoft.com/office/drawing/2015/10/21/chartex" xmlns:cx3="http://schemas.microsoft.com/office/drawing/2016/5/9/chartex" xmlns:cx4="http://schemas.microsoft.com/office/drawing/2016/5/10/chartex" xmlns:cx5="http://schemas.microsoft.com/office/drawing/2016/5/11/chartex" xmlns:cx6="http://schemas.microsoft.com/office/drawing/2016/5/12/chartex" xmlns:cx7="http://schemas.microsoft.com/office/drawing/2016/5/13/chartex" xmlns:cx8="http://schemas.microsoft.com/office/drawing/2016/5/14/chartex" xmlns:mc="http://schemas.openxmlformats.org/markup-compatibility/2006" xmlns:aink="http://schemas.microsoft.com/office/drawing/2016/ink" xmlns:am3d="http://schemas.microsoft.com/office/drawing/2017/model3d" xmlns:o="urn:schemas-microsoft-com:office:office" xmlns:r="http://schemas.openxmlformats.org/officeDocument/2006/relationships" xmlns:m="http://schemas.openxmlformats.org/officeDocument/2006/math" xmlns:v="urn:schemas-microsoft-com:vml" xmlns:wp14="http://schemas.microsoft.com/office/word/2010/wordprocessingDrawing" xmlns:wp="http://schemas.openxmlformats.org/drawingml/2006/wordprocessingDrawing" xmlns:w10="urn:schemas-microsoft-com:office:word" xmlns:w="http://schemas.openxmlformats.org/wordprocessingml/2006/main" xmlns:w14="http://schemas.microsoft.com/office/word/2010/wordml" xmlns:w15="http://schemas.microsoft.com/office/word/2012/wordml" xmlns:w16cex="http://schemas.microsoft.com/office/word/2018/wordml/cex" xmlns:w16cid="http://schemas.microsoft.com/office/word/2016/wordml/cid" xmlns:w16="http://schemas.microsoft.com/office/word/2018/wordml" xmlns:w16sdtdh="http://schemas.microsoft.com/office/word/2020/wordml/sdtdatahash" xmlns:w16se="http://schemas.microsoft.com/office/word/2015/wordml/symex" xmlns:wpg="http://schemas.microsoft.com/office/word/2010/wordprocessingGroup" xmlns:wpi="http://schemas.microsoft.com/office/word/2010/wordprocessingInk" xmlns:wne="http://schemas.microsoft.com/office/word/2006/wordml" xmlns:wps="http://schemas.microsoft.com/office/word/2010/wordprocessingShape" mc:Ignorable="w14 w15 w16se w16cid w16 w16cex w16sdtdh wp14">
   <w:p>
     <w:pPr>

</xml_diff>